<commit_message>
Resumo de atividade — 16 de setembro de 2026
</commit_message>
<xml_diff>
--- a/Resumo_atividade/Resumo_atividade_SurveyOS_20260916.docx
+++ b/Resumo_atividade/Resumo_atividade_SurveyOS_20260916.docx
@@ -49,7 +49,7 @@
           <w:sz w:val="18"/>
           <w:szCs w:val="18"/>
         </w:rPr>
-        <w:t xml:space="preserve">Posição em 16 de setembro de 2026   ·   235 ordens de serviço avaliadas   ·   Redes — PR, SP, MG, —</w:t>
+        <w:t xml:space="preserve">Posição em 16 de setembro de 2026   ·   238 ordens de serviço avaliadas   ·   Redes — PR, SP, MG, —</w:t>
       </w:r>
     </w:p>
     <w:tbl>
@@ -96,7 +96,7 @@
                 <w:sz w:val="24"/>
                 <w:szCs w:val="24"/>
               </w:rPr>
-              <w:t xml:space="preserve">Das 235 ordens avaliadas, 208 foram encerradas. PR concluiu 154 das 170 abertas na região; SP concluiu 30 das 36 abertas na região; MG concluiu 23 das 26 abertas na região. Todas as regiões têm técnico atribuído em ao menos uma ordem.</w:t>
+              <w:t xml:space="preserve">Das 238 ordens avaliadas, 216 foram encerradas. PR concluiu 160 das 172 abertas na região; SP concluiu 30 das 37 abertas na região; MG concluiu 25 das 26 abertas na região; — concluiu 1 das 3 abertas na região. Todas as regiões têm técnico atribuído em ao menos uma ordem.</w:t>
             </w:r>
           </w:p>
         </w:tc>
@@ -155,7 +155,7 @@
                 <w:sz w:val="44"/>
                 <w:szCs w:val="44"/>
               </w:rPr>
-              <w:t xml:space="preserve">235</w:t>
+              <w:t xml:space="preserve">238</w:t>
             </w:r>
           </w:p>
           <w:p>
@@ -205,7 +205,7 @@
                 <w:sz w:val="44"/>
                 <w:szCs w:val="44"/>
               </w:rPr>
-              <w:t xml:space="preserve">208</w:t>
+              <w:t xml:space="preserve">216</w:t>
             </w:r>
           </w:p>
           <w:p>
@@ -255,7 +255,7 @@
                 <w:sz w:val="44"/>
                 <w:szCs w:val="44"/>
               </w:rPr>
-              <w:t xml:space="preserve">16</w:t>
+              <w:t xml:space="preserve">1</w:t>
             </w:r>
           </w:p>
           <w:p>
@@ -305,7 +305,7 @@
                 <w:sz w:val="44"/>
                 <w:szCs w:val="44"/>
               </w:rPr>
-              <w:t xml:space="preserve">6</w:t>
+              <w:t xml:space="preserve">4</w:t>
             </w:r>
           </w:p>
           <w:p>
@@ -361,7 +361,7 @@
           <w:sz w:val="20"/>
           <w:szCs w:val="20"/>
         </w:rPr>
-        <w:t xml:space="preserve">PR tem técnico atribuído em 156 das 170 ordens, com 154 encerradas. SP tem técnico atribuído em 36 das 36 ordens, com 30 encerradas. MG tem técnico atribuído em 26 das 26 ordens, com 23 encerradas. — tem técnico atribuído em 1 das 3 ordens, com 1 encerrada.</w:t>
+        <w:t xml:space="preserve">PR tem técnico atribuído em 171 das 172 ordens, com 160 encerradas. SP tem técnico atribuído em 37 das 37 ordens, com 30 encerradas. MG tem técnico atribuído em 26 das 26 ordens, com 25 encerradas. — tem técnico atribuído em 3 das 3 ordens, com 1 encerrada.</w:t>
       </w:r>
     </w:p>
     <w:tbl>
@@ -717,11 +717,11 @@
                 <w:rFonts w:ascii="Calibri" w:cs="Calibri" w:eastAsia="Calibri" w:hAnsi="Calibri"/>
                 <w:b/>
                 <w:bCs/>
-                <w:color w:val="9A6212"/>
+                <w:color w:val="1B7A4B"/>
                 <w:sz w:val="19"/>
                 <w:szCs w:val="19"/>
               </w:rPr>
-              <w:t xml:space="preserve">Parcial</w:t>
+              <w:t xml:space="preserve">Operando</w:t>
             </w:r>
           </w:p>
         </w:tc>
@@ -788,7 +788,7 @@
                 <w:sz w:val="24"/>
                 <w:szCs w:val="24"/>
               </w:rPr>
-              <w:t xml:space="preserve">170</w:t>
+              <w:t xml:space="preserve">172</w:t>
             </w:r>
           </w:p>
         </w:tc>
@@ -822,7 +822,7 @@
                 <w:sz w:val="24"/>
                 <w:szCs w:val="24"/>
               </w:rPr>
-              <w:t xml:space="preserve">36</w:t>
+              <w:t xml:space="preserve">37</w:t>
             </w:r>
           </w:p>
         </w:tc>
@@ -957,7 +957,7 @@
                 <w:sz w:val="24"/>
                 <w:szCs w:val="24"/>
               </w:rPr>
-              <w:t xml:space="preserve">156</w:t>
+              <w:t xml:space="preserve">171</w:t>
             </w:r>
           </w:p>
         </w:tc>
@@ -991,7 +991,7 @@
                 <w:sz w:val="24"/>
                 <w:szCs w:val="24"/>
               </w:rPr>
-              <w:t xml:space="preserve">36</w:t>
+              <w:t xml:space="preserve">37</w:t>
             </w:r>
           </w:p>
         </w:tc>
@@ -1059,7 +1059,7 @@
                 <w:sz w:val="24"/>
                 <w:szCs w:val="24"/>
               </w:rPr>
-              <w:t xml:space="preserve">1</w:t>
+              <w:t xml:space="preserve">3</w:t>
             </w:r>
           </w:p>
         </w:tc>
@@ -1126,7 +1126,7 @@
                 <w:sz w:val="24"/>
                 <w:szCs w:val="24"/>
               </w:rPr>
-              <w:t xml:space="preserve">154</w:t>
+              <w:t xml:space="preserve">160</w:t>
             </w:r>
           </w:p>
         </w:tc>
@@ -1194,7 +1194,7 @@
                 <w:sz w:val="24"/>
                 <w:szCs w:val="24"/>
               </w:rPr>
-              <w:t xml:space="preserve">23</w:t>
+              <w:t xml:space="preserve">25</w:t>
             </w:r>
           </w:p>
         </w:tc>
@@ -1267,7 +1267,7 @@
           <w:sz w:val="20"/>
           <w:szCs w:val="20"/>
         </w:rPr>
-        <w:t xml:space="preserve">14 ordens estão abertas em 4 cidades, sem técnico atribuído. A região já tem técnicos atuando, então o que resta é fila de delegação pendente, não falta de cadastro.</w:t>
+        <w:t xml:space="preserve">1 ordem está aberta em 1 cidade, sem técnico atribuído. A região já tem técnicos atuando, então o que resta é fila de delegação pendente, não falta de cadastro.</w:t>
       </w:r>
     </w:p>
     <w:tbl>
@@ -1381,7 +1381,7 @@
                 <w:sz w:val="16"/>
                 <w:szCs w:val="16"/>
               </w:rPr>
-              <w:t xml:space="preserve">dias da mais antiga (OS-2026-0256, Prudentópolis)</w:t>
+              <w:t xml:space="preserve">dias da mais antiga (OS-2026-0275, Goioerê)</w:t>
             </w:r>
           </w:p>
         </w:tc>

</xml_diff>